<commit_message>
Update documentation files and interview Q&A guide with latest SOLID architecture and RAGAS self-correction details
</commit_message>
<xml_diff>
--- a/RAG_Pipeline_Full_Documentation.docx
+++ b/RAG_Pipeline_Full_Documentation.docx
@@ -858,6 +858,129 @@
         <w:t>User inputs query -&gt; Selects search technique (e.g. Hybrid, Rerank) -&gt; Backend queries Supabase -&gt; Combines results using reciprocal rank fusion (RRF) -&gt; Passes context to LLM -&gt; LLM generates final answer -&gt; UI appends result to Session History.</w:t>
       </w:r>
     </w:p>
+    <w:p>
+      <w:pPr>
+        <w:pStyle w:val="Heading1"/>
+      </w:pPr>
+      <w:r>
+        <w:t>Production Hardening &amp; Architecture Evolution Updates</w:t>
+      </w:r>
+    </w:p>
+    <w:p>
+      <w:r>
+        <w:t>This section documents the latest enterprise hardening updates, SOLID architecture refactoring, and self-reflective evaluation loop implementation added to the Enterprise RAG Pipeline.</w:t>
+      </w:r>
+    </w:p>
+    <w:p>
+      <w:pPr>
+        <w:pStyle w:val="Heading2"/>
+      </w:pPr>
+      <w:r>
+        <w:t>1. Tiered LLM Architecture &amp; SOLID Refactoring</w:t>
+      </w:r>
+    </w:p>
+    <w:p>
+      <w:r>
+        <w:rPr>
+          <w:b/>
+        </w:rPr>
+        <w:t xml:space="preserve">• SOLID Compliance (Interface Segregation &amp; Dependency Inversion): </w:t>
+      </w:r>
+      <w:r>
+        <w:t xml:space="preserve">Implemented Abstract Base Class </w:t>
+      </w:r>
+      <w:r>
+        <w:rPr>
+          <w:b/>
+        </w:rPr>
+        <w:t>ILLMService</w:t>
+      </w:r>
+      <w:r>
+        <w:t xml:space="preserve"> defining unified contracts for generation. Decoupled provider SDKs from business logic.</w:t>
+      </w:r>
+    </w:p>
+    <w:p>
+      <w:r>
+        <w:rPr>
+          <w:b/>
+        </w:rPr>
+        <w:t xml:space="preserve">• Three-Tiered Failover Hierarchy: </w:t>
+      </w:r>
+      <w:r>
+        <w:t>Primary Generator: Tencent Hy3 (Hunyuan-T1 via HF client). Secondary / Judge: Gemini 3.1 Flash Lite. Vision Fallback: Qwen 3.5 Omni.</w:t>
+      </w:r>
+    </w:p>
+    <w:p>
+      <w:pPr>
+        <w:pStyle w:val="Heading2"/>
+      </w:pPr>
+      <w:r>
+        <w:t>2. Self-Reflective RAGAS Evaluation Loop</w:t>
+      </w:r>
+    </w:p>
+    <w:p>
+      <w:r>
+        <w:rPr>
+          <w:b/>
+        </w:rPr>
+        <w:t xml:space="preserve">• Autonomous Self-Correction: </w:t>
+      </w:r>
+      <w:r>
+        <w:t xml:space="preserve">The RAGAS evaluation module (ragas_eval.py) evaluates generated responses for Faithfulness and Relevancy. </w:t>
+      </w:r>
+      <w:r>
+        <w:t>If scores drop below 0.8, the system automatically captures judge feedback, reformulates the prompt, and retries generation (up to 2 iterations).</w:t>
+      </w:r>
+    </w:p>
+    <w:p>
+      <w:r>
+        <w:rPr>
+          <w:b/>
+        </w:rPr>
+        <w:t xml:space="preserve">• Metadata Traceability: </w:t>
+      </w:r>
+      <w:r>
+        <w:t>Detailed scores, retry count, and refinement feedback are attached directly to the API response metadata for full auditing.</w:t>
+      </w:r>
+    </w:p>
+    <w:p>
+      <w:pPr>
+        <w:pStyle w:val="Heading2"/>
+      </w:pPr>
+      <w:r>
+        <w:t>3. Security Hardening &amp; Secret Management</w:t>
+      </w:r>
+    </w:p>
+    <w:p>
+      <w:r>
+        <w:rPr>
+          <w:b/>
+        </w:rPr>
+        <w:t xml:space="preserve">• Zero-Leakage Credential Policy: </w:t>
+      </w:r>
+      <w:r>
+        <w:t>Sanitized config.py, eliminated all hardcoded Gemini API keys, and mandated runtime retrieval from environment variables (.env / HF Space Secrets).</w:t>
+      </w:r>
+    </w:p>
+    <w:p>
+      <w:pPr>
+        <w:pStyle w:val="Heading2"/>
+      </w:pPr>
+      <w:r>
+        <w:t>4. RAG Fundamentals Frontend Enhancements</w:t>
+      </w:r>
+    </w:p>
+    <w:p>
+      <w:r>
+        <w:rPr>
+          <w:b/>
+        </w:rPr>
+        <w:t xml:space="preserve">• Elaborate Real-World Use-Case Showcase: </w:t>
+      </w:r>
+      <w:r>
+        <w:t>Enriched FundamentalsPage.jsx with 4 detailed industry application scenarios: Enterprise Internal Knowledge Base, Customer Support Automation, Legal &amp; Medical Contract Analysis, and CBSE/NCERT Educational Tutoring.</w:t>
+      </w:r>
+    </w:p>
     <w:sectPr>
       <w:footerReference w:type="default" r:id="rId9"/>
       <w:pgSz w:w="12240" w:h="15840"/>

</xml_diff>